<commit_message>
updated description of Table S3
</commit_message>
<xml_diff>
--- a/Supplemental Files/Table S3.docx
+++ b/Supplemental Files/Table S3.docx
@@ -1,6 +1,6 @@
 
 <file path=word/document.xml><?xml version="1.0" encoding="utf-8"?>
-<w:document xmlns:wpc="http://schemas.microsoft.com/office/word/2010/wordprocessingCanvas" xmlns:cx="http://schemas.microsoft.com/office/drawing/2014/chartex" xmlns:cx1="http://schemas.microsoft.com/office/drawing/2015/9/8/chartex" xmlns:cx2="http://schemas.microsoft.com/office/drawing/2015/10/21/chartex" xmlns:cx3="http://schemas.microsoft.com/office/drawing/2016/5/9/chartex" xmlns:cx4="http://schemas.microsoft.com/office/drawing/2016/5/10/chartex" xmlns:cx5="http://schemas.microsoft.com/office/drawing/2016/5/11/chartex" xmlns:cx6="http://schemas.microsoft.com/office/drawing/2016/5/12/chartex" xmlns:cx7="http://schemas.microsoft.com/office/drawing/2016/5/13/chartex" xmlns:cx8="http://schemas.microsoft.com/office/drawing/2016/5/14/chartex" xmlns:mc="http://schemas.openxmlformats.org/markup-compatibility/2006" xmlns:aink="http://schemas.microsoft.com/office/drawing/2016/ink" xmlns:am3d="http://schemas.microsoft.com/office/drawing/2017/model3d" xmlns:o="urn:schemas-microsoft-com:office:office" xmlns:oel="http://schemas.microsoft.com/office/2019/extlst" xmlns:r="http://schemas.openxmlformats.org/officeDocument/2006/relationships" xmlns:m="http://schemas.openxmlformats.org/officeDocument/2006/math" xmlns:v="urn:schemas-microsoft-com:vml" xmlns:wp14="http://schemas.microsoft.com/office/word/2010/wordprocessingDrawing" xmlns:wp="http://schemas.openxmlformats.org/drawingml/2006/wordprocessingDrawing" xmlns:w10="urn:schemas-microsoft-com:office:word" xmlns:w="http://schemas.openxmlformats.org/wordprocessingml/2006/main" xmlns:w14="http://schemas.microsoft.com/office/word/2010/wordml" xmlns:w15="http://schemas.microsoft.com/office/word/2012/wordml" xmlns:w16cex="http://schemas.microsoft.com/office/word/2018/wordml/cex" xmlns:w16cid="http://schemas.microsoft.com/office/word/2016/wordml/cid" xmlns:w16="http://schemas.microsoft.com/office/word/2018/wordml" xmlns:w16du="http://schemas.microsoft.com/office/word/2023/wordml/word16du" xmlns:w16sdtdh="http://schemas.microsoft.com/office/word/2020/wordml/sdtdatahash" xmlns:w16sdtfl="http://schemas.microsoft.com/office/word/2024/wordml/sdtformatlock" xmlns:w16se="http://schemas.microsoft.com/office/word/2015/wordml/symex" xmlns:wpg="http://schemas.microsoft.com/office/word/2010/wordprocessingGroup" xmlns:wpi="http://schemas.microsoft.com/office/word/2010/wordprocessingInk" xmlns:wne="http://schemas.microsoft.com/office/word/2006/wordml" xmlns:wps="http://schemas.microsoft.com/office/word/2010/wordprocessingShape" mc:Ignorable="w14 w15 w16se w16cid w16 w16cex w16sdtdh w16sdtfl w16du wp14">
+<w:document xmlns:wpc="http://schemas.microsoft.com/office/word/2010/wordprocessingCanvas" xmlns:cx="http://schemas.microsoft.com/office/drawing/2014/chartex" xmlns:cx1="http://schemas.microsoft.com/office/drawing/2015/9/8/chartex" xmlns:cx2="http://schemas.microsoft.com/office/drawing/2015/10/21/chartex" xmlns:cx3="http://schemas.microsoft.com/office/drawing/2016/5/9/chartex" xmlns:cx4="http://schemas.microsoft.com/office/drawing/2016/5/10/chartex" xmlns:cx5="http://schemas.microsoft.com/office/drawing/2016/5/11/chartex" xmlns:cx6="http://schemas.microsoft.com/office/drawing/2016/5/12/chartex" xmlns:cx7="http://schemas.microsoft.com/office/drawing/2016/5/13/chartex" xmlns:cx8="http://schemas.microsoft.com/office/drawing/2016/5/14/chartex" xmlns:mc="http://schemas.openxmlformats.org/markup-compatibility/2006" xmlns:aink="http://schemas.microsoft.com/office/drawing/2016/ink" xmlns:am3d="http://schemas.microsoft.com/office/drawing/2017/model3d" xmlns:o="urn:schemas-microsoft-com:office:office" xmlns:oel="http://schemas.microsoft.com/office/2019/extlst" xmlns:r="http://schemas.openxmlformats.org/officeDocument/2006/relationships" xmlns:m="http://schemas.openxmlformats.org/officeDocument/2006/math" xmlns:v="urn:schemas-microsoft-com:vml" xmlns:wp14="http://schemas.microsoft.com/office/word/2010/wordprocessingDrawing" xmlns:wp="http://schemas.openxmlformats.org/drawingml/2006/wordprocessingDrawing" xmlns:w10="urn:schemas-microsoft-com:office:word" xmlns:w="http://schemas.openxmlformats.org/wordprocessingml/2006/main" xmlns:w14="http://schemas.microsoft.com/office/word/2010/wordml" xmlns:w15="http://schemas.microsoft.com/office/word/2012/wordml" xmlns:w16cei="http://schemas.microsoft.com/office/word/2026/wordml/cei" xmlns:w16cex="http://schemas.microsoft.com/office/word/2018/wordml/cex" xmlns:w16cid="http://schemas.microsoft.com/office/word/2016/wordml/cid" xmlns:w16="http://schemas.microsoft.com/office/word/2018/wordml" xmlns:w16du="http://schemas.microsoft.com/office/word/2023/wordml/word16du" xmlns:w16sdtdh="http://schemas.microsoft.com/office/word/2020/wordml/sdtdatahash" xmlns:w16sdtfl="http://schemas.microsoft.com/office/word/2024/wordml/sdtformatlock" xmlns:w16se="http://schemas.microsoft.com/office/word/2015/wordml/symex" xmlns:wpg="http://schemas.microsoft.com/office/word/2010/wordprocessingGroup" xmlns:wpi="http://schemas.microsoft.com/office/word/2010/wordprocessingInk" xmlns:wne="http://schemas.microsoft.com/office/word/2006/wordml" xmlns:wps="http://schemas.microsoft.com/office/word/2010/wordprocessingShape" mc:Ignorable="w14 w15 w16se w16cid w16 w16cex w16sdtdh w16sdtfl w16du wp14">
   <w:body>
     <w:p>
       <w:pPr>
@@ -51,6 +51,7 @@
           <w:tcPr>
             <w:tcW w:w="1951" w:type="dxa"/>
             <w:vMerge w:val="restart"/>
+            <w:vAlign w:val="center"/>
           </w:tcPr>
           <w:p>
             <w:pPr>
@@ -76,6 +77,7 @@
           <w:tcPr>
             <w:tcW w:w="2552" w:type="dxa"/>
             <w:gridSpan w:val="2"/>
+            <w:vAlign w:val="center"/>
           </w:tcPr>
           <w:p>
             <w:pPr>
@@ -119,7 +121,7 @@
           <w:tcPr>
             <w:tcW w:w="2551" w:type="dxa"/>
             <w:gridSpan w:val="2"/>
-            <w:vAlign w:val="bottom"/>
+            <w:vAlign w:val="center"/>
           </w:tcPr>
           <w:p>
             <w:pPr>
@@ -143,6 +145,7 @@
           <w:tcPr>
             <w:tcW w:w="1276" w:type="dxa"/>
             <w:vMerge w:val="restart"/>
+            <w:vAlign w:val="center"/>
           </w:tcPr>
           <w:p>
             <w:pPr>
@@ -166,6 +169,7 @@
           <w:tcPr>
             <w:tcW w:w="1276" w:type="dxa"/>
             <w:vMerge w:val="restart"/>
+            <w:vAlign w:val="center"/>
           </w:tcPr>
           <w:p>
             <w:pPr>
@@ -183,6 +187,14 @@
                 <w:bCs/>
               </w:rPr>
               <w:t>Enrichment FDR</w:t>
+            </w:r>
+            <w:r>
+              <w:rPr>
+                <w:rFonts w:asciiTheme="majorHAnsi" w:hAnsiTheme="majorHAnsi" w:cstheme="majorHAnsi"/>
+                <w:b/>
+                <w:bCs/>
+              </w:rPr>
+              <w:t>**</w:t>
             </w:r>
           </w:p>
         </w:tc>
@@ -204,6 +216,7 @@
         <w:tc>
           <w:tcPr>
             <w:tcW w:w="1276" w:type="dxa"/>
+            <w:vAlign w:val="center"/>
           </w:tcPr>
           <w:p>
             <w:pPr>
@@ -226,6 +239,7 @@
         <w:tc>
           <w:tcPr>
             <w:tcW w:w="1276" w:type="dxa"/>
+            <w:vAlign w:val="center"/>
           </w:tcPr>
           <w:p>
             <w:pPr>
@@ -248,6 +262,7 @@
         <w:tc>
           <w:tcPr>
             <w:tcW w:w="1275" w:type="dxa"/>
+            <w:vAlign w:val="center"/>
           </w:tcPr>
           <w:p>
             <w:pPr>
@@ -270,6 +285,7 @@
         <w:tc>
           <w:tcPr>
             <w:tcW w:w="1276" w:type="dxa"/>
+            <w:vAlign w:val="center"/>
           </w:tcPr>
           <w:p>
             <w:pPr>
@@ -1655,6 +1671,38 @@
         <w:t>* Active promoters represent all promoters with CAGE-detected transcription &gt; 0.1 TPM in at least one analyzed developmental stage.</w:t>
       </w:r>
     </w:p>
+    <w:p>
+      <w:pPr>
+        <w:jc w:val="both"/>
+        <w:rPr>
+          <w:rFonts w:ascii="Arial" w:hAnsi="Arial" w:cs="Arial"/>
+        </w:rPr>
+      </w:pPr>
+      <w:r>
+        <w:rPr>
+          <w:rFonts w:ascii="Arial" w:hAnsi="Arial" w:cs="Arial"/>
+        </w:rPr>
+        <w:t xml:space="preserve">** </w:t>
+      </w:r>
+      <w:r>
+        <w:rPr>
+          <w:rFonts w:ascii="Arial" w:hAnsi="Arial" w:cs="Arial"/>
+        </w:rPr>
+        <w:t>Motif enrichment was assessed using Fisher’s exact test, with P values adjusted for multiple testing using the Benjamini–Hochberg</w:t>
+      </w:r>
+      <w:r>
+        <w:rPr>
+          <w:rFonts w:ascii="Arial" w:hAnsi="Arial" w:cs="Arial"/>
+        </w:rPr>
+        <w:t xml:space="preserve"> </w:t>
+      </w:r>
+      <w:r>
+        <w:rPr>
+          <w:rFonts w:ascii="Arial" w:hAnsi="Arial" w:cs="Arial"/>
+        </w:rPr>
+        <w:t>method.</w:t>
+      </w:r>
+    </w:p>
     <w:sectPr>
       <w:pgSz w:w="12240" w:h="15840"/>
       <w:pgMar w:top="1440" w:right="1800" w:bottom="1440" w:left="1800" w:header="720" w:footer="720" w:gutter="0"/>
@@ -1666,7 +1714,7 @@
 </file>
 
 <file path=word/numbering.xml><?xml version="1.0" encoding="utf-8"?>
-<w:numbering xmlns:wpc="http://schemas.microsoft.com/office/word/2010/wordprocessingCanvas" xmlns:cx="http://schemas.microsoft.com/office/drawing/2014/chartex" xmlns:cx1="http://schemas.microsoft.com/office/drawing/2015/9/8/chartex" xmlns:cx2="http://schemas.microsoft.com/office/drawing/2015/10/21/chartex" xmlns:cx3="http://schemas.microsoft.com/office/drawing/2016/5/9/chartex" xmlns:cx4="http://schemas.microsoft.com/office/drawing/2016/5/10/chartex" xmlns:cx5="http://schemas.microsoft.com/office/drawing/2016/5/11/chartex" xmlns:cx6="http://schemas.microsoft.com/office/drawing/2016/5/12/chartex" xmlns:cx7="http://schemas.microsoft.com/office/drawing/2016/5/13/chartex" xmlns:cx8="http://schemas.microsoft.com/office/drawing/2016/5/14/chartex" xmlns:mc="http://schemas.openxmlformats.org/markup-compatibility/2006" xmlns:aink="http://schemas.microsoft.com/office/drawing/2016/ink" xmlns:am3d="http://schemas.microsoft.com/office/drawing/2017/model3d" xmlns:o="urn:schemas-microsoft-com:office:office" xmlns:oel="http://schemas.microsoft.com/office/2019/extlst" xmlns:r="http://schemas.openxmlformats.org/officeDocument/2006/relationships" xmlns:m="http://schemas.openxmlformats.org/officeDocument/2006/math" xmlns:v="urn:schemas-microsoft-com:vml" xmlns:wp14="http://schemas.microsoft.com/office/word/2010/wordprocessingDrawing" xmlns:wp="http://schemas.openxmlformats.org/drawingml/2006/wordprocessingDrawing" xmlns:w10="urn:schemas-microsoft-com:office:word" xmlns:w="http://schemas.openxmlformats.org/wordprocessingml/2006/main" xmlns:w14="http://schemas.microsoft.com/office/word/2010/wordml" xmlns:w15="http://schemas.microsoft.com/office/word/2012/wordml" xmlns:w16cex="http://schemas.microsoft.com/office/word/2018/wordml/cex" xmlns:w16cid="http://schemas.microsoft.com/office/word/2016/wordml/cid" xmlns:w16="http://schemas.microsoft.com/office/word/2018/wordml" xmlns:w16du="http://schemas.microsoft.com/office/word/2023/wordml/word16du" xmlns:w16sdtdh="http://schemas.microsoft.com/office/word/2020/wordml/sdtdatahash" xmlns:w16sdtfl="http://schemas.microsoft.com/office/word/2024/wordml/sdtformatlock" xmlns:w16se="http://schemas.microsoft.com/office/word/2015/wordml/symex" xmlns:wpg="http://schemas.microsoft.com/office/word/2010/wordprocessingGroup" xmlns:wpi="http://schemas.microsoft.com/office/word/2010/wordprocessingInk" xmlns:wne="http://schemas.microsoft.com/office/word/2006/wordml" xmlns:wps="http://schemas.microsoft.com/office/word/2010/wordprocessingShape" mc:Ignorable="w14 w15 w16se w16cid w16 w16cex w16sdtdh w16sdtfl w16du wp14">
+<w:numbering xmlns:wpc="http://schemas.microsoft.com/office/word/2010/wordprocessingCanvas" xmlns:cx="http://schemas.microsoft.com/office/drawing/2014/chartex" xmlns:cx1="http://schemas.microsoft.com/office/drawing/2015/9/8/chartex" xmlns:cx2="http://schemas.microsoft.com/office/drawing/2015/10/21/chartex" xmlns:cx3="http://schemas.microsoft.com/office/drawing/2016/5/9/chartex" xmlns:cx4="http://schemas.microsoft.com/office/drawing/2016/5/10/chartex" xmlns:cx5="http://schemas.microsoft.com/office/drawing/2016/5/11/chartex" xmlns:cx6="http://schemas.microsoft.com/office/drawing/2016/5/12/chartex" xmlns:cx7="http://schemas.microsoft.com/office/drawing/2016/5/13/chartex" xmlns:cx8="http://schemas.microsoft.com/office/drawing/2016/5/14/chartex" xmlns:mc="http://schemas.openxmlformats.org/markup-compatibility/2006" xmlns:aink="http://schemas.microsoft.com/office/drawing/2016/ink" xmlns:am3d="http://schemas.microsoft.com/office/drawing/2017/model3d" xmlns:o="urn:schemas-microsoft-com:office:office" xmlns:oel="http://schemas.microsoft.com/office/2019/extlst" xmlns:r="http://schemas.openxmlformats.org/officeDocument/2006/relationships" xmlns:m="http://schemas.openxmlformats.org/officeDocument/2006/math" xmlns:v="urn:schemas-microsoft-com:vml" xmlns:wp14="http://schemas.microsoft.com/office/word/2010/wordprocessingDrawing" xmlns:wp="http://schemas.openxmlformats.org/drawingml/2006/wordprocessingDrawing" xmlns:w10="urn:schemas-microsoft-com:office:word" xmlns:w="http://schemas.openxmlformats.org/wordprocessingml/2006/main" xmlns:w14="http://schemas.microsoft.com/office/word/2010/wordml" xmlns:w15="http://schemas.microsoft.com/office/word/2012/wordml" xmlns:w16cei="http://schemas.microsoft.com/office/word/2026/wordml/cei" xmlns:w16cex="http://schemas.microsoft.com/office/word/2018/wordml/cex" xmlns:w16cid="http://schemas.microsoft.com/office/word/2016/wordml/cid" xmlns:w16="http://schemas.microsoft.com/office/word/2018/wordml" xmlns:w16du="http://schemas.microsoft.com/office/word/2023/wordml/word16du" xmlns:w16sdtdh="http://schemas.microsoft.com/office/word/2020/wordml/sdtdatahash" xmlns:w16sdtfl="http://schemas.microsoft.com/office/word/2024/wordml/sdtformatlock" xmlns:w16se="http://schemas.microsoft.com/office/word/2015/wordml/symex" xmlns:wpg="http://schemas.microsoft.com/office/word/2010/wordprocessingGroup" xmlns:wpi="http://schemas.microsoft.com/office/word/2010/wordprocessingInk" xmlns:wne="http://schemas.microsoft.com/office/word/2006/wordml" xmlns:wps="http://schemas.microsoft.com/office/word/2010/wordprocessingShape" mc:Ignorable="w14 w15 w16se w16cid w16 w16cex w16sdtdh w16sdtfl w16du wp14">
   <w:abstractNum w:abstractNumId="0" w15:restartNumberingAfterBreak="0">
     <w:nsid w:val="FFFFFF7C"/>
     <w:multiLevelType w:val="singleLevel"/>
@@ -2471,7 +2519,6 @@
   <w:style w:type="character" w:default="1" w:styleId="Standardnpsmoodstavce">
     <w:name w:val="Default Paragraph Font"/>
     <w:uiPriority w:val="1"/>
-    <w:semiHidden/>
     <w:unhideWhenUsed/>
   </w:style>
   <w:style w:type="table" w:default="1" w:styleId="Normlntabulka">

</xml_diff>

<commit_message>
updated Table S3 description
</commit_message>
<xml_diff>
--- a/Supplemental Files/Table S3.docx
+++ b/Supplemental Files/Table S3.docx
@@ -29,6 +29,18 @@
         </w:rPr>
         <w:t>The occurrence of motifs/TFBS modules was assessed in regions from -50 to -150 bp upstream of each TSS.</w:t>
       </w:r>
+      <w:r>
+        <w:rPr>
+          <w:rFonts w:ascii="Arial" w:hAnsi="Arial" w:cs="Arial"/>
+        </w:rPr>
+        <w:t xml:space="preserve"> </w:t>
+      </w:r>
+      <w:r>
+        <w:rPr>
+          <w:rFonts w:ascii="Arial" w:hAnsi="Arial" w:cs="Arial"/>
+        </w:rPr>
+        <w:t>The enrichment was calculated against a background set of all active promoters with CAGE signal &gt; 0.1 TPM.</w:t>
+      </w:r>
     </w:p>
     <w:tbl>
       <w:tblPr>
@@ -194,7 +206,7 @@
                 <w:b/>
                 <w:bCs/>
               </w:rPr>
-              <w:t>**</w:t>
+              <w:t>*</w:t>
             </w:r>
           </w:p>
         </w:tc>
@@ -1668,21 +1680,7 @@
         <w:rPr>
           <w:rFonts w:ascii="Arial" w:hAnsi="Arial" w:cs="Arial"/>
         </w:rPr>
-        <w:t>* Active promoters represent all promoters with CAGE-detected transcription &gt; 0.1 TPM in at least one analyzed developmental stage.</w:t>
-      </w:r>
-    </w:p>
-    <w:p>
-      <w:pPr>
-        <w:jc w:val="both"/>
-        <w:rPr>
-          <w:rFonts w:ascii="Arial" w:hAnsi="Arial" w:cs="Arial"/>
-        </w:rPr>
-      </w:pPr>
-      <w:r>
-        <w:rPr>
-          <w:rFonts w:ascii="Arial" w:hAnsi="Arial" w:cs="Arial"/>
-        </w:rPr>
-        <w:t xml:space="preserve">** </w:t>
+        <w:t xml:space="preserve">* </w:t>
       </w:r>
       <w:r>
         <w:rPr>
@@ -2519,6 +2517,7 @@
   <w:style w:type="character" w:default="1" w:styleId="Standardnpsmoodstavce">
     <w:name w:val="Default Paragraph Font"/>
     <w:uiPriority w:val="1"/>
+    <w:semiHidden/>
     <w:unhideWhenUsed/>
   </w:style>
   <w:style w:type="table" w:default="1" w:styleId="Normlntabulka">

</xml_diff>